<commit_message>
docs: insert Zenodo DOI into IJIR submission package
</commit_message>
<xml_diff>
--- a/06_manuscript/ijir_v0_1_20260720/03_submission_files/IJIR_Cover_Letter_v0_1.docx
+++ b/06_manuscript/ijir_v0_1_20260720/03_submission_files/IJIR_Cover_Letter_v0_1.docx
@@ -9,7 +9,12 @@
     </w:p>
     <w:p>
       <w:r>
-        <w:t>Editors International Journal of Impotence Research</w:t>
+        <w:t>Editors</w:t>
+      </w:r>
+    </w:p>
+    <w:p>
+      <w:r>
+        <w:t>International Journal of Impotence Research</w:t>
       </w:r>
     </w:p>
     <w:p>
@@ -48,6 +53,11 @@
     </w:p>
     <w:p>
       <w:r>
+        <w:t>Analysis code, provenance receipts, frozen summary results, and manuscript-associated materials are publicly archived at https://doi.org/10.5281/zenodo.21456671. Third-party GWAS payloads are not redistributed.</w:t>
+      </w:r>
+    </w:p>
+    <w:p>
+      <w:r>
         <w:t>The manuscript lists Ming Chen, Chunhui Liu, and Chao Sun as corresponding authors. If the submission system permits only one corresponding author, please use Chao Sun as the primary submission contact.</w:t>
       </w:r>
     </w:p>
@@ -58,7 +68,27 @@
     </w:p>
     <w:p>
       <w:r>
-        <w:t>Chao Sun, PhD Department of Urology, Zhongda Hospital, Southeast University 87 Dingjiaqiao Road, Nanjing, Jiangsu 210009, China Email: csun@seu.edu.cn ORCID: 0000-0003-0538-1239</w:t>
+        <w:t>Chao Sun, PhD</w:t>
+      </w:r>
+    </w:p>
+    <w:p>
+      <w:r>
+        <w:t>Department of Urology, Zhongda Hospital, Southeast University</w:t>
+      </w:r>
+    </w:p>
+    <w:p>
+      <w:r>
+        <w:t>87 Dingjiaqiao Road, Nanjing, Jiangsu 210009, China</w:t>
+      </w:r>
+    </w:p>
+    <w:p>
+      <w:r>
+        <w:t>Email: csun@seu.edu.cn</w:t>
+      </w:r>
+    </w:p>
+    <w:p>
+      <w:r>
+        <w:t>ORCID: 0000-0003-0538-1239</w:t>
       </w:r>
     </w:p>
     <w:p>

</xml_diff>